<commit_message>
removed 'fictituous' labels from the sample docs
</commit_message>
<xml_diff>
--- a/docs/sample-expense/documents/01_Expense_Reimbursement_SOP.docx
+++ b/docs/sample-expense/documents/01_Expense_Reimbursement_SOP.docx
@@ -950,7 +950,7 @@
     </w:p>
     <w:p>
       <w:r>
-        <w:t>Finance retains expense claims and supporting documents for seven years. This document and all references are fictional and created solely for product demonstration.</w:t>
+        <w:t>Finance retains expense claims and supporting documents for seven years.</w:t>
       </w:r>
     </w:p>
     <w:sectPr>
@@ -979,7 +979,7 @@
         <w:color w:val="5B6573"/>
         <w:sz w:val="16"/>
       </w:rPr>
-      <w:t>Fictional demo material - Q2 2025</w:t>
+      <w:t>Q2 2025</w:t>
     </w:r>
   </w:p>
 </w:ftr>

</xml_diff>